<commit_message>
Adds deleting and adding list-entries (procedure/ medication)
</commit_message>
<xml_diff>
--- a/src/output/output.docx
+++ b/src/output/output.docx
@@ -109,7 +109,7 @@
                 <w:sz w:val="24"/>
                 <w:szCs w:val="24"/>
               </w:rPr>
-              <w:t>MLA-018626</w:t>
+              <w:t>MLA-018104</w:t>
             </w:r>
           </w:p>
         </w:tc>
@@ -148,7 +148,7 @@
                 <w:sz w:val="24"/>
                 <w:szCs w:val="24"/>
               </w:rPr>
-              <w:t>DOB: 2022-01-20</w:t>
+              <w:t>DOB: 2022-03-31</w:t>
             </w:r>
           </w:p>
         </w:tc>
@@ -221,7 +221,7 @@
                 <w:sz w:val="24"/>
                 <w:szCs w:val="24"/>
               </w:rPr>
-              <w:t>Starting weight: 21</w:t>
+              <w:t xml:space="preserve">Starting weight: </w:t>
             </w:r>
           </w:p>
         </w:tc>
@@ -257,7 +257,7 @@
                 <w:sz w:val="24"/>
                 <w:szCs w:val="24"/>
               </w:rPr>
-              <w:t>Sex: f</w:t>
+              <w:t>Sex: m</w:t>
             </w:r>
           </w:p>
         </w:tc>
@@ -499,7 +499,7 @@
           </w:tcPr>
           <w:p>
             <w:r>
-              <w:t>2022-11-18</w:t>
+              <w:t>2022-11-04</w:t>
             </w:r>
           </w:p>
         </w:tc>
@@ -509,7 +509,7 @@
           </w:tcPr>
           <w:p>
             <w:r>
-              <w:t>Jan van Dick</w:t>
+              <w:t>Maristany Eduardo</w:t>
             </w:r>
           </w:p>
         </w:tc>
@@ -531,7 +531,7 @@
           </w:tcPr>
           <w:p>
             <w:r>
-              <w:t>2022-11-20</w:t>
+              <w:t>2022-11-06</w:t>
             </w:r>
           </w:p>
         </w:tc>
@@ -541,7 +541,7 @@
           </w:tcPr>
           <w:p>
             <w:r>
-              <w:t>Jan van Dick</w:t>
+              <w:t>Maristany Eduardo</w:t>
             </w:r>
           </w:p>
         </w:tc>
@@ -563,7 +563,7 @@
           </w:tcPr>
           <w:p>
             <w:r>
-              <w:t>2022-11-20</w:t>
+              <w:t>2022-11-06</w:t>
             </w:r>
           </w:p>
         </w:tc>
@@ -573,7 +573,7 @@
           </w:tcPr>
           <w:p>
             <w:r>
-              <w:t>Jan van Dick</w:t>
+              <w:t>Maristany Eduardo</w:t>
             </w:r>
           </w:p>
         </w:tc>
@@ -595,7 +595,7 @@
           </w:tcPr>
           <w:p>
             <w:r>
-              <w:t>2022-11-20</w:t>
+              <w:t>2022-11-06</w:t>
             </w:r>
           </w:p>
         </w:tc>
@@ -605,7 +605,7 @@
           </w:tcPr>
           <w:p>
             <w:r>
-              <w:t>Jan van Dick</w:t>
+              <w:t>Maristany Eduardo</w:t>
             </w:r>
           </w:p>
         </w:tc>
@@ -627,7 +627,7 @@
           </w:tcPr>
           <w:p>
             <w:r>
-              <w:t>2022-11-20</w:t>
+              <w:t>2022-11-06</w:t>
             </w:r>
           </w:p>
         </w:tc>
@@ -637,7 +637,7 @@
           </w:tcPr>
           <w:p>
             <w:r>
-              <w:t>Jan van Dick</w:t>
+              <w:t>Maristany Eduardo</w:t>
             </w:r>
           </w:p>
         </w:tc>
@@ -806,7 +806,7 @@
           </w:tcPr>
           <w:p>
             <w:r>
-              <w:t>2022-11-24</w:t>
+              <w:t>2022-11-10</w:t>
             </w:r>
           </w:p>
         </w:tc>
@@ -816,7 +816,7 @@
           </w:tcPr>
           <w:p>
             <w:r>
-              <w:t>Jan van Dick</w:t>
+              <w:t>Maristany Eduardo</w:t>
             </w:r>
           </w:p>
         </w:tc>
@@ -838,7 +838,7 @@
           </w:tcPr>
           <w:p>
             <w:r>
-              <w:t>2022-11-26</w:t>
+              <w:t>2022-11-12</w:t>
             </w:r>
           </w:p>
         </w:tc>
@@ -848,7 +848,7 @@
           </w:tcPr>
           <w:p>
             <w:r>
-              <w:t>Jan van Dick</w:t>
+              <w:t>Maristany Eduardo</w:t>
             </w:r>
           </w:p>
         </w:tc>
@@ -870,6 +870,38 @@
           </w:tcPr>
           <w:p>
             <w:r>
+              <w:t>2022-11-16</w:t>
+            </w:r>
+          </w:p>
+        </w:tc>
+        <w:tc>
+          <w:tcPr>
+            <w:tcW w:type="dxa" w:w="3231"/>
+          </w:tcPr>
+          <w:p>
+            <w:r>
+              <w:t>Maristany Eduardo</w:t>
+            </w:r>
+          </w:p>
+        </w:tc>
+      </w:tr>
+      <w:tr>
+        <w:tc>
+          <w:tcPr>
+            <w:tcW w:type="dxa" w:w="3230"/>
+          </w:tcPr>
+          <w:p>
+            <w:r>
+              <w:t>optogenetics</w:t>
+            </w:r>
+          </w:p>
+        </w:tc>
+        <w:tc>
+          <w:tcPr>
+            <w:tcW w:type="dxa" w:w="3230"/>
+          </w:tcPr>
+          <w:p>
+            <w:r>
               <w:t>2022-11-30</w:t>
             </w:r>
           </w:p>
@@ -880,7 +912,7 @@
           </w:tcPr>
           <w:p>
             <w:r>
-              <w:t>Jan van Dick</w:t>
+              <w:t>Maristany Eduardo</w:t>
             </w:r>
           </w:p>
         </w:tc>
@@ -892,7 +924,7 @@
           </w:tcPr>
           <w:p>
             <w:r>
-              <w:t>optogenetics</w:t>
+              <w:t>2-photon microscopy</w:t>
             </w:r>
           </w:p>
         </w:tc>
@@ -902,7 +934,7 @@
           </w:tcPr>
           <w:p>
             <w:r>
-              <w:t>2022-12-14</w:t>
+              <w:t>2022-12-01</w:t>
             </w:r>
           </w:p>
         </w:tc>
@@ -912,7 +944,7 @@
           </w:tcPr>
           <w:p>
             <w:r>
-              <w:t>Jan van Dick</w:t>
+              <w:t>Maristany Eduardo</w:t>
             </w:r>
           </w:p>
         </w:tc>
@@ -924,7 +956,7 @@
           </w:tcPr>
           <w:p>
             <w:r>
-              <w:t>2-photon microscopy</w:t>
+              <w:t>2-photon microscopy 2</w:t>
             </w:r>
           </w:p>
         </w:tc>
@@ -934,7 +966,7 @@
           </w:tcPr>
           <w:p>
             <w:r>
-              <w:t>2022-12-15</w:t>
+              <w:t>2022-12-02</w:t>
             </w:r>
           </w:p>
         </w:tc>
@@ -944,7 +976,7 @@
           </w:tcPr>
           <w:p>
             <w:r>
-              <w:t>Jan van Dick</w:t>
+              <w:t>Maristany Eduardo</w:t>
             </w:r>
           </w:p>
         </w:tc>
@@ -1233,7 +1265,7 @@
           </w:tcPr>
           <w:p>
             <w:r>
-              <w:t>2022-11-18</w:t>
+              <w:t>2022-11-04</w:t>
             </w:r>
           </w:p>
         </w:tc>
@@ -1285,7 +1317,7 @@
           </w:tcPr>
           <w:p>
             <w:r>
-              <w:t>2022-11-18</w:t>
+              <w:t>2022-11-04</w:t>
             </w:r>
           </w:p>
         </w:tc>
@@ -1520,7 +1552,7 @@
           </w:tcPr>
           <w:p>
             <w:r>
-              <w:t>2022-11-18</w:t>
+              <w:t>2022-11-04</w:t>
             </w:r>
           </w:p>
         </w:tc>
@@ -1562,7 +1594,7 @@
           </w:tcPr>
           <w:p>
             <w:r>
-              <w:t>2022-11-19</w:t>
+              <w:t>2022-11-05</w:t>
             </w:r>
           </w:p>
         </w:tc>
@@ -1604,7 +1636,7 @@
           </w:tcPr>
           <w:p>
             <w:r>
-              <w:t>2022-11-20</w:t>
+              <w:t>2022-11-06</w:t>
             </w:r>
           </w:p>
         </w:tc>
@@ -1646,7 +1678,7 @@
           </w:tcPr>
           <w:p>
             <w:r>
-              <w:t>2022-11-21</w:t>
+              <w:t>2022-11-07</w:t>
             </w:r>
           </w:p>
         </w:tc>
@@ -1893,7 +1925,7 @@
           </w:tcPr>
           <w:p>
             <w:r>
-              <w:t>2022-11-18</w:t>
+              <w:t>2022-11-04</w:t>
             </w:r>
           </w:p>
         </w:tc>
@@ -1925,6 +1957,48 @@
           </w:tcPr>
           <w:p>
             <w:r>
+              <w:t>Carprofen</w:t>
+            </w:r>
+          </w:p>
+        </w:tc>
+        <w:tc>
+          <w:tcPr>
+            <w:tcW w:type="dxa" w:w="2367"/>
+          </w:tcPr>
+          <w:p>
+            <w:r>
+              <w:t>2022-11-04</w:t>
+            </w:r>
+          </w:p>
+        </w:tc>
+        <w:tc>
+          <w:tcPr>
+            <w:tcW w:type="dxa" w:w="2366"/>
+          </w:tcPr>
+          <w:p>
+            <w:r>
+              <w:t>1x μl</w:t>
+            </w:r>
+          </w:p>
+        </w:tc>
+        <w:tc>
+          <w:tcPr>
+            <w:tcW w:type="dxa" w:w="2442"/>
+          </w:tcPr>
+          <w:p>
+            <w:r>
+              <w:t xml:space="preserve">5 mg pro kg </w:t>
+            </w:r>
+          </w:p>
+        </w:tc>
+      </w:tr>
+      <w:tr>
+        <w:tc>
+          <w:tcPr>
+            <w:tcW w:type="dxa" w:w="2364"/>
+          </w:tcPr>
+          <w:p>
+            <w:r>
               <w:t>Lidocaine</w:t>
             </w:r>
           </w:p>
@@ -1935,7 +2009,7 @@
           </w:tcPr>
           <w:p>
             <w:r>
-              <w:t>2022-11-18</w:t>
+              <w:t>2022-11-04</w:t>
             </w:r>
           </w:p>
         </w:tc>
@@ -1977,7 +2051,7 @@
           </w:tcPr>
           <w:p>
             <w:r>
-              <w:t>2022-11-18</w:t>
+              <w:t>2022-11-05</w:t>
             </w:r>
           </w:p>
         </w:tc>
@@ -2019,7 +2093,7 @@
           </w:tcPr>
           <w:p>
             <w:r>
-              <w:t>2022-11-19</w:t>
+              <w:t>2022-11-06</w:t>
             </w:r>
           </w:p>
         </w:tc>
@@ -2061,49 +2135,7 @@
           </w:tcPr>
           <w:p>
             <w:r>
-              <w:t>2022-11-20</w:t>
-            </w:r>
-          </w:p>
-        </w:tc>
-        <w:tc>
-          <w:tcPr>
-            <w:tcW w:type="dxa" w:w="2366"/>
-          </w:tcPr>
-          <w:p>
-            <w:r>
-              <w:t>1x μl</w:t>
-            </w:r>
-          </w:p>
-        </w:tc>
-        <w:tc>
-          <w:tcPr>
-            <w:tcW w:type="dxa" w:w="2442"/>
-          </w:tcPr>
-          <w:p>
-            <w:r>
-              <w:t xml:space="preserve">5 mg pro kg </w:t>
-            </w:r>
-          </w:p>
-        </w:tc>
-      </w:tr>
-      <w:tr>
-        <w:tc>
-          <w:tcPr>
-            <w:tcW w:type="dxa" w:w="2364"/>
-          </w:tcPr>
-          <w:p>
-            <w:r>
-              <w:t>Carprofen</w:t>
-            </w:r>
-          </w:p>
-        </w:tc>
-        <w:tc>
-          <w:tcPr>
-            <w:tcW w:type="dxa" w:w="2367"/>
-          </w:tcPr>
-          <w:p>
-            <w:r>
-              <w:t>2022-11-21</w:t>
+              <w:t>2022-11-07</w:t>
             </w:r>
           </w:p>
         </w:tc>
@@ -2401,7 +2433,7 @@
                 <w:sz w:val="24"/>
                 <w:szCs w:val="24"/>
               </w:rPr>
-              <w:t>2022-12-22</w:t>
+              <w:t>2022-12-08</w:t>
             </w:r>
           </w:p>
         </w:tc>
@@ -2850,7 +2882,7 @@
           <w:sz w:val="24"/>
           <w:szCs w:val="24"/>
         </w:rPr>
-        <w:t>Jan van Dick</w:t>
+        <w:t>Maristany Eduardo</w:t>
       </w:r>
     </w:p>
     <w:sectPr>
@@ -2941,7 +2973,7 @@
         <w:szCs w:val="24"/>
         <w:u w:val="none"/>
       </w:rPr>
-      <w:t>Individual responsible: Jan van Dick</w:t>
+      <w:t>Individual responsible: Maristany Eduardo</w:t>
     </w:r>
   </w:p>
   <w:p>

</xml_diff>